<commit_message>
Refine resume portfolio wording
</commit_message>
<xml_diff>
--- a/assets/resume/James_Andrade_Cloud_Security_TAM_Resume.docx
+++ b/assets/resume/James_Andrade_Cloud_Security_TAM_Resume.docx
@@ -68,7 +68,20 @@
           <w:b w:val="0"/>
           <w:sz w:val="16"/>
         </w:rPr>
-        <w:t>Owns technical delivery and customer onboarding for managed-service clients, including discovery, architecture review, automation-platform installation, implementation planning, production validation, documentation, and operational handoff.</w:t>
+        <w:t>Owns technical delivery and customer onboarding for managed-service clients, including discovery, architecture review, automation platform installation, implementation planning, production validation, documentation, and operational handoff.</w:t>
+      </w:r>
+    </w:p>
+    <w:p>
+      <w:pPr>
+        <w:pStyle w:val="CompactBody"/>
+      </w:pPr>
+      <w:r>
+        <w:rPr>
+          <w:rFonts w:ascii="Arial" w:hAnsi="Arial"/>
+          <w:b w:val="0"/>
+          <w:sz w:val="16"/>
+        </w:rPr>
+        <w:t>Works across managed services and professional services, seeing the client timeline from discovery meetings and environment deployment through ongoing improvements, support, and lifecycle work.</w:t>
       </w:r>
     </w:p>
     <w:p>
@@ -151,7 +164,7 @@
           <w:b w:val="0"/>
           <w:sz w:val="15"/>
         </w:rPr>
-        <w:t xml:space="preserve"> EKS, ECS, EC2, VPC, IAM, ALB, NLB, Route 53, CloudFront, CloudWatch, KMS, EBS, S3, AWS WAF, Secrets Manager, RDS, Auto Scaling, Launch Templates</w:t>
+        <w:t xml:space="preserve"> ECS, EC2, VPC, IAM, ALB, NLB, Route 53, CloudFront, CloudWatch, KMS, EBS, S3, AWS WAF, Secrets Manager, RDS, Auto Scaling, Launch Templates</w:t>
       </w:r>
     </w:p>
     <w:p>
@@ -364,7 +377,7 @@
           <w:b w:val="0"/>
           <w:sz w:val="15"/>
         </w:rPr>
-        <w:t>- Own billable consulting and customer onboarding across AWS, Azure, and Google Cloud, from discovery and architecture review through automation-platform installation, infrastructure deployment, validation, documentation, and operational handoff.</w:t>
+        <w:t>- Own managed services and professional services delivery across AWS, Azure, and Google Cloud, from discovery meetings and architecture review through environment deployment, automation platform installation, validation, ongoing improvement, support, documentation, and handoff.</w:t>
       </w:r>
     </w:p>
     <w:p>
@@ -377,7 +390,7 @@
           <w:b w:val="0"/>
           <w:sz w:val="15"/>
         </w:rPr>
-        <w:t>- Delivered 40+ client projects covering platform redesign, Terraform refactoring, Kubernetes operations, cloud security controls, monitoring and security agent rollout, FinOps agent rollout, backup and policy baselines, infrastructure deployment, and cost optimization.</w:t>
+        <w:t>- Delivered dozens of client projects covering platform redesign, Terraform refactoring, Kubernetes operations, cloud security controls, monitoring and security agent rollout, FinOps agent rollout, backup and policy baselines, infrastructure deployment, and cost optimization.</w:t>
       </w:r>
     </w:p>
     <w:p>
@@ -429,7 +442,7 @@
           <w:b w:val="0"/>
           <w:sz w:val="15"/>
         </w:rPr>
-        <w:t>- Delivered $180K in measurable 2025 business value through automation, advisory work, lifecycle management, and platform cleanup, including $42K in direct client savings beyond standard support scope.</w:t>
+        <w:t>- Created measurable client and internal value through automation, advisory work, lifecycle management, and platform cleanup, including $42K in direct client savings beyond standard support scope.</w:t>
       </w:r>
     </w:p>
     <w:p>
@@ -513,7 +526,7 @@
           <w:b/>
           <w:sz w:val="18"/>
         </w:rPr>
-        <w:t>Enterprise EKS Lifecycle and Upgrade Program</w:t>
+        <w:t>Client Platform Onboarding and Automation Enablement</w:t>
       </w:r>
     </w:p>
     <w:p>
@@ -526,7 +539,7 @@
           <w:b w:val="0"/>
           <w:sz w:val="15"/>
         </w:rPr>
-        <w:t>- Led staged EKS lifecycle upgrades across sandbox, development, stage, production, and shared environments, coordinating Kubernetes control plane, managed add-on, node group, AMI, and Launch Template changes through customer-approved maintenance windows.</w:t>
+        <w:t>- Onboarded customer environments into automation and managed-service platforms by enabling backup coverage, establishing policy baselines, creating and linking Git repositories, standardizing Terraform folders and files, and deploying the environment foundation.</w:t>
       </w:r>
     </w:p>
     <w:p>
@@ -539,7 +552,7 @@
           <w:b w:val="0"/>
           <w:sz w:val="15"/>
         </w:rPr>
-        <w:t>- Moved application platforms through sequential Kubernetes versions, including 1.33 to 1.34 and 1.34 to 1.35 to 1.36 paths, with rolling node replacement, target group health checks, load balancer validation, workload verification, and rollback planning.</w:t>
+        <w:t>- Automated monitoring, security tooling, and FinOps agent installation, then validated agent health, data flow, backup and policy coverage, scan findings, and platform functionality before handoff.</w:t>
       </w:r>
     </w:p>
     <w:p>
@@ -552,22 +565,7 @@
           <w:b w:val="0"/>
           <w:sz w:val="15"/>
         </w:rPr>
-        <w:t>- Folded security remediation into lifecycle work by updating worker AMIs and EKS add-ons while reducing production risk through environment sequencing and post-upgrade validation.</w:t>
-      </w:r>
-    </w:p>
-    <w:p>
-      <w:pPr>
-        <w:pStyle w:val="Heading2"/>
-        <w:keepNext/>
-        <w:spacing w:before="52" w:after="12"/>
-      </w:pPr>
-      <w:r>
-        <w:rPr>
-          <w:rFonts w:ascii="Arial" w:hAnsi="Arial"/>
-          <w:b/>
-          <w:sz w:val="18"/>
-        </w:rPr>
-        <w:t>EKS Ingress, Gateway Fabric, and Load Balancer Migration</w:t>
+        <w:t>- Used environment scans to surface key findings such as orphaned resources, unattached disks, access gaps, logging blind spots, and Zero Trust control placement.</w:t>
       </w:r>
     </w:p>
     <w:p>
@@ -580,107 +578,7 @@
           <w:b w:val="0"/>
           <w:sz w:val="15"/>
         </w:rPr>
-        <w:t>- Migrated legacy NGINX Ingress patterns toward NGINX Gateway Fabric across enterprise EKS clusters where WAF inspection, oauth2-proxy authentication, header injection, path-based routing, and application annotations were tied to the existing ingress design.</w:t>
-      </w:r>
-    </w:p>
-    <w:p>
-      <w:pPr>
-        <w:pStyle w:val="CompactBullet"/>
-      </w:pPr>
-      <w:r>
-        <w:rPr>
-          <w:rFonts w:ascii="Arial" w:hAnsi="Arial"/>
-          <w:b w:val="0"/>
-          <w:sz w:val="15"/>
-        </w:rPr>
-        <w:t>- Retargeted NLB listeners from legacy ingress services to Gateway Fabric services, adding Security Group rules for replacement NodePorts and validating node reachability, target health, authentication flows, and internal/external application routing.</w:t>
-      </w:r>
-    </w:p>
-    <w:p>
-      <w:pPr>
-        <w:pStyle w:val="Heading2"/>
-        <w:keepNext/>
-        <w:spacing w:before="52" w:after="12"/>
-      </w:pPr>
-      <w:r>
-        <w:rPr>
-          <w:rFonts w:ascii="Arial" w:hAnsi="Arial"/>
-          <w:b/>
-          <w:sz w:val="18"/>
-        </w:rPr>
-        <w:t>Azure Defender for Storage Malware Quarantine Automation</w:t>
-      </w:r>
-    </w:p>
-    <w:p>
-      <w:pPr>
-        <w:pStyle w:val="CompactBullet"/>
-      </w:pPr>
-      <w:r>
-        <w:rPr>
-          <w:rFonts w:ascii="Arial" w:hAnsi="Arial"/>
-          <w:b w:val="0"/>
-          <w:sz w:val="15"/>
-        </w:rPr>
-        <w:t>- Built an event-driven malware response workflow using Microsoft Defender for Storage, Event Grid, Azure Functions, C# isolated worker, .NET, Blob Storage, Azure Monitor, and Application Insights.</w:t>
-      </w:r>
-    </w:p>
-    <w:p>
-      <w:pPr>
-        <w:pStyle w:val="CompactBullet"/>
-      </w:pPr>
-      <w:r>
-        <w:rPr>
-          <w:rFonts w:ascii="Arial" w:hAnsi="Arial"/>
-          <w:b w:val="0"/>
-          <w:sz w:val="15"/>
-        </w:rPr>
-        <w:t>- Processed Defender scan results for uploaded objects, filtered source-container events, ignored clean verdicts, copied malicious blobs to a quarantine container, and preserved the original object for investigation and audit requirements.</w:t>
-      </w:r>
-    </w:p>
-    <w:p>
-      <w:r>
-        <w:br w:type="page"/>
-      </w:r>
-    </w:p>
-    <w:p>
-      <w:pPr>
-        <w:pStyle w:val="Heading2"/>
-        <w:keepNext/>
-        <w:spacing w:before="52" w:after="12"/>
-      </w:pPr>
-      <w:r>
-        <w:rPr>
-          <w:rFonts w:ascii="Arial" w:hAnsi="Arial"/>
-          <w:b/>
-          <w:sz w:val="18"/>
-        </w:rPr>
-        <w:t>EKS Security Hardening and Production Troubleshooting</w:t>
-      </w:r>
-    </w:p>
-    <w:p>
-      <w:pPr>
-        <w:pStyle w:val="CompactBullet"/>
-      </w:pPr>
-      <w:r>
-        <w:rPr>
-          <w:rFonts w:ascii="Arial" w:hAnsi="Arial"/>
-          <w:b w:val="0"/>
-          <w:sz w:val="15"/>
-        </w:rPr>
-        <w:t>- Implemented KMS-backed EBS encryption for EKS worker nodes by updating EC2 Launch Templates and coordinating rolling node replacement, accounting for the fact that existing node volumes are not remediated until nodes are replaced.</w:t>
-      </w:r>
-    </w:p>
-    <w:p>
-      <w:pPr>
-        <w:pStyle w:val="CompactBullet"/>
-      </w:pPr>
-      <w:r>
-        <w:rPr>
-          <w:rFonts w:ascii="Arial" w:hAnsi="Arial"/>
-          <w:b w:val="0"/>
-          <w:sz w:val="15"/>
-        </w:rPr>
-        <w:t>- Investigated memory pressure on Karpenter and AL2023 worker nodes using Datadog, Kubernetes events, node utilization, pod placement, resource requests, actual memory use, workload density, and provisioning behavior.</w:t>
+        <w:t>- Supported multi-customer Azure operations through Azure Lighthouse delegated resource management, validating RBAC boundaries, subscription context, managed-service visibility, and cross-tenant administration paths.</w:t>
       </w:r>
     </w:p>
     <w:p>
@@ -749,6 +647,183 @@
           <w:b/>
           <w:sz w:val="18"/>
         </w:rPr>
+        <w:t>Azure Defender for Storage Malware Quarantine Automation</w:t>
+      </w:r>
+    </w:p>
+    <w:p>
+      <w:pPr>
+        <w:pStyle w:val="CompactBullet"/>
+      </w:pPr>
+      <w:r>
+        <w:rPr>
+          <w:rFonts w:ascii="Arial" w:hAnsi="Arial"/>
+          <w:b w:val="0"/>
+          <w:sz w:val="15"/>
+        </w:rPr>
+        <w:t>- Built an event-driven malware response workflow using Microsoft Defender for Storage, Event Grid, Azure Functions, C# isolated worker, .NET, Blob Storage, Azure Monitor, and Application Insights.</w:t>
+      </w:r>
+    </w:p>
+    <w:p>
+      <w:pPr>
+        <w:pStyle w:val="CompactBullet"/>
+      </w:pPr>
+      <w:r>
+        <w:rPr>
+          <w:rFonts w:ascii="Arial" w:hAnsi="Arial"/>
+          <w:b w:val="0"/>
+          <w:sz w:val="15"/>
+        </w:rPr>
+        <w:t>- Processed Defender scan results for uploaded objects, filtered source-container events, ignored clean verdicts, copied malicious blobs to a quarantine container, and preserved the original object for investigation and audit requirements.</w:t>
+      </w:r>
+    </w:p>
+    <w:p>
+      <w:pPr>
+        <w:pStyle w:val="Heading2"/>
+        <w:keepNext/>
+        <w:spacing w:before="52" w:after="12"/>
+      </w:pPr>
+      <w:r>
+        <w:rPr>
+          <w:rFonts w:ascii="Arial" w:hAnsi="Arial"/>
+          <w:b/>
+          <w:sz w:val="18"/>
+        </w:rPr>
+        <w:t>Kubernetes (AKS) Lifecycle and Upgrade Process</w:t>
+      </w:r>
+    </w:p>
+    <w:p>
+      <w:pPr>
+        <w:pStyle w:val="CompactBullet"/>
+      </w:pPr>
+      <w:r>
+        <w:rPr>
+          <w:rFonts w:ascii="Arial" w:hAnsi="Arial"/>
+          <w:b w:val="0"/>
+          <w:sz w:val="15"/>
+        </w:rPr>
+        <w:t>- Led staged Kubernetes lifecycle and upgrade work across sandbox, development, stage, production, and shared environments, coordinating control plane, managed add-on, node pool, image, and template changes through customer-approved maintenance windows.</w:t>
+      </w:r>
+    </w:p>
+    <w:p>
+      <w:pPr>
+        <w:pStyle w:val="CompactBullet"/>
+      </w:pPr>
+      <w:r>
+        <w:rPr>
+          <w:rFonts w:ascii="Arial" w:hAnsi="Arial"/>
+          <w:b w:val="0"/>
+          <w:sz w:val="15"/>
+        </w:rPr>
+        <w:t>- Moved application platforms through sequential Kubernetes versions with rolling node replacement, health checks, load balancer validation, workload verification, and rollback planning.</w:t>
+      </w:r>
+    </w:p>
+    <w:p>
+      <w:pPr>
+        <w:pStyle w:val="CompactBullet"/>
+      </w:pPr>
+      <w:r>
+        <w:rPr>
+          <w:rFonts w:ascii="Arial" w:hAnsi="Arial"/>
+          <w:b w:val="0"/>
+          <w:sz w:val="15"/>
+        </w:rPr>
+        <w:t>- Folded security remediation into lifecycle work by updating worker images and Kubernetes add-ons while reducing production risk through environment sequencing and post-upgrade validation.</w:t>
+      </w:r>
+    </w:p>
+    <w:p>
+      <w:pPr>
+        <w:pStyle w:val="Heading2"/>
+        <w:keepNext/>
+        <w:spacing w:before="52" w:after="12"/>
+      </w:pPr>
+      <w:r>
+        <w:rPr>
+          <w:rFonts w:ascii="Arial" w:hAnsi="Arial"/>
+          <w:b/>
+          <w:sz w:val="18"/>
+        </w:rPr>
+        <w:t>Kubernetes Ingress and Security Policy Controls</w:t>
+      </w:r>
+    </w:p>
+    <w:p>
+      <w:pPr>
+        <w:pStyle w:val="CompactBullet"/>
+      </w:pPr>
+      <w:r>
+        <w:rPr>
+          <w:rFonts w:ascii="Arial" w:hAnsi="Arial"/>
+          <w:b w:val="0"/>
+          <w:sz w:val="15"/>
+        </w:rPr>
+        <w:t>- Supported Kubernetes ingress designs around routing, authentication, WAF placement, TLS, network reachability, and application validation without tying the design to one controller pattern.</w:t>
+      </w:r>
+    </w:p>
+    <w:p>
+      <w:pPr>
+        <w:pStyle w:val="CompactBullet"/>
+      </w:pPr>
+      <w:r>
+        <w:rPr>
+          <w:rFonts w:ascii="Arial" w:hAnsi="Arial"/>
+          <w:b w:val="0"/>
+          <w:sz w:val="15"/>
+        </w:rPr>
+        <w:t>- Built the AKS equivalent for ingress and security policy work, including private access, RBAC, Azure Policy, network controls, workload identity, monitoring signal flow, and policy validation.</w:t>
+      </w:r>
+    </w:p>
+    <w:p>
+      <w:pPr>
+        <w:pStyle w:val="Heading2"/>
+        <w:keepNext/>
+        <w:spacing w:before="52" w:after="12"/>
+      </w:pPr>
+      <w:r>
+        <w:rPr>
+          <w:rFonts w:ascii="Arial" w:hAnsi="Arial"/>
+          <w:b/>
+          <w:sz w:val="18"/>
+        </w:rPr>
+        <w:t>Kubernetes Platform Troubleshooting and Add-On Operations</w:t>
+      </w:r>
+    </w:p>
+    <w:p>
+      <w:pPr>
+        <w:pStyle w:val="CompactBullet"/>
+      </w:pPr>
+      <w:r>
+        <w:rPr>
+          <w:rFonts w:ascii="Arial" w:hAnsi="Arial"/>
+          <w:b w:val="0"/>
+          <w:sz w:val="15"/>
+        </w:rPr>
+        <w:t>- Troubleshot managed Kubernetes platform issues across add-ons, worker image updates, autoscaling behavior, ingress behavior, node pressure, pod placement, resource requests, and monitoring signal gaps.</w:t>
+      </w:r>
+    </w:p>
+    <w:p>
+      <w:pPr>
+        <w:pStyle w:val="CompactBullet"/>
+      </w:pPr>
+      <w:r>
+        <w:rPr>
+          <w:rFonts w:ascii="Arial" w:hAnsi="Arial"/>
+          <w:b w:val="0"/>
+          <w:sz w:val="15"/>
+        </w:rPr>
+        <w:t>- Used Datadog, Kubernetes events, node utilization, workload density, provisioning behavior, and add-on state to separate platform problems from application resource pressure.</w:t>
+      </w:r>
+    </w:p>
+    <w:p>
+      <w:pPr>
+        <w:pStyle w:val="Heading2"/>
+        <w:keepNext/>
+        <w:spacing w:before="52" w:after="12"/>
+      </w:pPr>
+      <w:r>
+        <w:rPr>
+          <w:rFonts w:ascii="Arial" w:hAnsi="Arial"/>
+          <w:b/>
+          <w:sz w:val="18"/>
+        </w:rPr>
         <w:t>AWS Application Platform and Private Networking</w:t>
       </w:r>
     </w:p>
@@ -762,7 +837,7 @@
           <w:b w:val="0"/>
           <w:sz w:val="15"/>
         </w:rPr>
-        <w:t>- Designed and supported AWS application platforms using Route 53, CloudFront, ALB/NLB, ECS services, EKS, EC2 Auto Scaling, private and public subnets, Security Groups, IAM roles, ECR, KMS, EBS, S3, CloudWatch, TLS certificates, and Terraform.</w:t>
+        <w:t>- Designed and supported AWS application platforms using Route 53, CloudFront, ALB/NLB, ECS services, managed Kubernetes workloads, EC2 Auto Scaling, private and public subnets, Security Groups, IAM roles, ECR, KMS, EBS, S3, CloudWatch, TLS certificates, and Terraform.</w:t>
       </w:r>
     </w:p>
     <w:p>
@@ -843,73 +918,6 @@
           <w:sz w:val="15"/>
         </w:rPr>
         <w:t>- Designed and supported GKE environments using private clusters, regional node pools, Shared VPC, Cloud NAT, Cloud Armor, Cloud DNS, Cloud Logging, Cloud Monitoring, IAM, Workload Identity, and Terraform-based delivery.</w:t>
-      </w:r>
-    </w:p>
-    <w:p>
-      <w:pPr>
-        <w:pStyle w:val="Heading2"/>
-        <w:keepNext/>
-        <w:spacing w:before="52" w:after="12"/>
-      </w:pPr>
-      <w:r>
-        <w:rPr>
-          <w:rFonts w:ascii="Arial" w:hAnsi="Arial"/>
-          <w:b/>
-          <w:sz w:val="18"/>
-        </w:rPr>
-        <w:t>Client Platform Onboarding and Automation Enablement</w:t>
-      </w:r>
-    </w:p>
-    <w:p>
-      <w:pPr>
-        <w:pStyle w:val="CompactBullet"/>
-      </w:pPr>
-      <w:r>
-        <w:rPr>
-          <w:rFonts w:ascii="Arial" w:hAnsi="Arial"/>
-          <w:b w:val="0"/>
-          <w:sz w:val="15"/>
-        </w:rPr>
-        <w:t>- Onboarded customer environments into automation and managed-service platforms by enabling backup coverage, establishing policy baselines, creating and linking Git repositories, standardizing Terraform folders and files, and deploying the environment foundation.</w:t>
-      </w:r>
-    </w:p>
-    <w:p>
-      <w:pPr>
-        <w:pStyle w:val="CompactBullet"/>
-      </w:pPr>
-      <w:r>
-        <w:rPr>
-          <w:rFonts w:ascii="Arial" w:hAnsi="Arial"/>
-          <w:b w:val="0"/>
-          <w:sz w:val="15"/>
-        </w:rPr>
-        <w:t>- Automated monitoring, security tooling, and FinOps agent installation, then validated agent health, data flow, backup and policy coverage, scan findings, and platform functionality before handoff.</w:t>
-      </w:r>
-    </w:p>
-    <w:p>
-      <w:pPr>
-        <w:pStyle w:val="CompactBullet"/>
-      </w:pPr>
-      <w:r>
-        <w:rPr>
-          <w:rFonts w:ascii="Arial" w:hAnsi="Arial"/>
-          <w:b w:val="0"/>
-          <w:sz w:val="15"/>
-        </w:rPr>
-        <w:t>- Used environment scans to surface key findings such as orphaned resources, unattached disks, access gaps, logging blind spots, and Zero Trust control placement.</w:t>
-      </w:r>
-    </w:p>
-    <w:p>
-      <w:pPr>
-        <w:pStyle w:val="CompactBullet"/>
-      </w:pPr>
-      <w:r>
-        <w:rPr>
-          <w:rFonts w:ascii="Arial" w:hAnsi="Arial"/>
-          <w:b w:val="0"/>
-          <w:sz w:val="15"/>
-        </w:rPr>
-        <w:t>- Supported multi-customer Azure operations through Azure Lighthouse delegated resource management, validating RBAC boundaries, subscription context, managed-service visibility, and cross-tenant administration paths.</w:t>
       </w:r>
     </w:p>
     <w:p>

</xml_diff>